<commit_message>
002 3.0: tensores de muros anclados en el larguero de 0.60 m
Los tensores 845-852 de los muros A y B regresan al larguero de 0.60 m
(como en el modelo del usuario) en lugar de la base de las columnas.
Mismos perfiles. CUT OFF 43, factores X 1.0973 / Z 1.0183.
6673.62 kg, 43.45 kg/m2 con 5% de conexiones. Se regeneran hoja de
sismo y viento, áreas tributarias, DXF, desglose y reacciones.

Co-Authored-By: Claude Opus 5.5 <noreply@anthropic.com>
Claude-Session: https://claude.ai/code/session_01DbpSpoM7qi5cJ9LMKpwgVv
</commit_message>
<xml_diff>
--- a/002/002_DESTRUCTURAL_H5H6_3.0.docx
+++ b/002/002_DESTRUCTURAL_H5H6_3.0.docx
@@ -263,7 +263,7 @@
                 <w:i w:val="0"/>
                 <w:sz w:val="17"/>
               </w:rPr>
-              <w:t>6,677.19 kg</w:t>
+              <w:t>6,673.62 kg</w:t>
             </w:r>
           </w:p>
         </w:tc>
@@ -349,7 +349,7 @@
                 <w:i w:val="0"/>
                 <w:sz w:val="17"/>
               </w:rPr>
-              <w:t>333.86 kg</w:t>
+              <w:t>333.68 kg</w:t>
             </w:r>
           </w:p>
         </w:tc>
@@ -395,7 +395,7 @@
                 <w:i w:val="0"/>
                 <w:sz w:val="17"/>
               </w:rPr>
-              <w:t>7,011.04 kg</w:t>
+              <w:t>7,007.30 kg</w:t>
             </w:r>
           </w:p>
         </w:tc>
@@ -439,7 +439,7 @@
                 <w:i w:val="0"/>
                 <w:sz w:val="17"/>
               </w:rPr>
-              <w:t>43.47 kg/m²</w:t>
+              <w:t>43.45 kg/m²</w:t>
             </w:r>
           </w:p>
         </w:tc>
@@ -525,7 +525,7 @@
                 <w:i w:val="0"/>
                 <w:sz w:val="17"/>
               </w:rPr>
-              <w:t>92.03 %</w:t>
+              <w:t>91.73 %</w:t>
             </w:r>
           </w:p>
         </w:tc>
@@ -569,7 +569,7 @@
                 <w:i w:val="0"/>
                 <w:sz w:val="17"/>
               </w:rPr>
-              <w:t>95.93 %</w:t>
+              <w:t>96.12 %</w:t>
             </w:r>
           </w:p>
         </w:tc>
@@ -655,7 +655,7 @@
                 <w:i w:val="0"/>
                 <w:sz w:val="17"/>
               </w:rPr>
-              <w:t>1.0929</w:t>
+              <w:t>1.0973</w:t>
             </w:r>
           </w:p>
         </w:tc>
@@ -697,7 +697,7 @@
                 <w:i w:val="0"/>
                 <w:sz w:val="17"/>
               </w:rPr>
-              <w:t>1.0108</w:t>
+              <w:t>1.0183</w:t>
             </w:r>
           </w:p>
         </w:tc>
@@ -5881,7 +5881,7 @@
                 <w:i w:val="0"/>
                 <w:sz w:val="17"/>
               </w:rPr>
-              <w:t>149.87</w:t>
+              <w:t>146.28</w:t>
             </w:r>
           </w:p>
         </w:tc>
@@ -5923,7 +5923,7 @@
                 <w:i w:val="0"/>
                 <w:sz w:val="17"/>
               </w:rPr>
-              <w:t>148.72</w:t>
+              <w:t>145.16</w:t>
             </w:r>
           </w:p>
         </w:tc>
@@ -5944,7 +5944,7 @@
                 <w:i w:val="0"/>
                 <w:sz w:val="17"/>
               </w:rPr>
-              <w:t>81.64%</w:t>
+              <w:t>81.28%</w:t>
             </w:r>
           </w:p>
         </w:tc>
@@ -6072,7 +6072,7 @@
                 <w:i w:val="0"/>
                 <w:sz w:val="17"/>
               </w:rPr>
-              <w:t>18.36%</w:t>
+              <w:t>18.72%</w:t>
             </w:r>
           </w:p>
         </w:tc>
@@ -6203,7 +6203,7 @@
                 <w:i w:val="0"/>
                 <w:sz w:val="17"/>
               </w:rPr>
-              <w:t>182.16 kg</w:t>
+              <w:t>178.59 kg</w:t>
             </w:r>
           </w:p>
         </w:tc>
@@ -6247,7 +6247,7 @@
                 <w:i w:val="0"/>
                 <w:sz w:val="17"/>
               </w:rPr>
-              <w:t>9.11 kg</w:t>
+              <w:t>8.93 kg</w:t>
             </w:r>
           </w:p>
         </w:tc>
@@ -6291,7 +6291,7 @@
                 <w:i w:val="0"/>
                 <w:sz w:val="17"/>
               </w:rPr>
-              <w:t>191.27 kg</w:t>
+              <w:t>187.52 kg</w:t>
             </w:r>
           </w:p>
         </w:tc>
@@ -6381,7 +6381,7 @@
                 <w:i w:val="0"/>
                 <w:sz w:val="17"/>
               </w:rPr>
-              <w:t>1.19 kg/m²</w:t>
+              <w:t>1.16 kg/m²</w:t>
             </w:r>
           </w:p>
         </w:tc>
@@ -7298,7 +7298,7 @@
                 <w:i w:val="0"/>
                 <w:sz w:val="17"/>
               </w:rPr>
-              <w:t>182.16</w:t>
+              <w:t>178.59</w:t>
             </w:r>
           </w:p>
         </w:tc>
@@ -7319,7 +7319,7 @@
                 <w:i w:val="0"/>
                 <w:sz w:val="17"/>
               </w:rPr>
-              <w:t>9.11</w:t>
+              <w:t>8.93</w:t>
             </w:r>
           </w:p>
         </w:tc>
@@ -7340,7 +7340,7 @@
                 <w:i w:val="0"/>
                 <w:sz w:val="17"/>
               </w:rPr>
-              <w:t>191.27</w:t>
+              <w:t>187.52</w:t>
             </w:r>
           </w:p>
         </w:tc>
@@ -7361,7 +7361,7 @@
                 <w:i w:val="0"/>
                 <w:sz w:val="17"/>
               </w:rPr>
-              <w:t>1.19</w:t>
+              <w:t>1.16</w:t>
             </w:r>
           </w:p>
         </w:tc>
@@ -7407,7 +7407,7 @@
                 <w:i w:val="0"/>
                 <w:sz w:val="17"/>
               </w:rPr>
-              <w:t>6,677.19</w:t>
+              <w:t>6,673.62</w:t>
             </w:r>
           </w:p>
         </w:tc>
@@ -7429,7 +7429,7 @@
                 <w:i w:val="0"/>
                 <w:sz w:val="17"/>
               </w:rPr>
-              <w:t>333.86</w:t>
+              <w:t>333.68</w:t>
             </w:r>
           </w:p>
         </w:tc>
@@ -7451,7 +7451,7 @@
                 <w:i w:val="0"/>
                 <w:sz w:val="17"/>
               </w:rPr>
-              <w:t>7,011.04</w:t>
+              <w:t>7,007.30</w:t>
             </w:r>
           </w:p>
         </w:tc>
@@ -7473,7 +7473,7 @@
                 <w:i w:val="0"/>
                 <w:sz w:val="17"/>
               </w:rPr>
-              <w:t>43.47</w:t>
+              <w:t>43.45</w:t>
             </w:r>
           </w:p>
         </w:tc>
@@ -7604,7 +7604,7 @@
                 <w:i w:val="0"/>
                 <w:sz w:val="17"/>
               </w:rPr>
-              <w:t>6,677.19 kg</w:t>
+              <w:t>6,673.62 kg</w:t>
             </w:r>
           </w:p>
         </w:tc>
@@ -7648,7 +7648,7 @@
                 <w:i w:val="0"/>
                 <w:sz w:val="17"/>
               </w:rPr>
-              <w:t>333.86 kg</w:t>
+              <w:t>333.68 kg</w:t>
             </w:r>
           </w:p>
         </w:tc>
@@ -7694,7 +7694,7 @@
                 <w:i w:val="0"/>
                 <w:sz w:val="17"/>
               </w:rPr>
-              <w:t>7,011.04 kg</w:t>
+              <w:t>7,007.30 kg</w:t>
             </w:r>
           </w:p>
         </w:tc>
@@ -7784,7 +7784,7 @@
                 <w:i w:val="0"/>
                 <w:sz w:val="17"/>
               </w:rPr>
-              <w:t>43.47 kg/m²</w:t>
+              <w:t>43.45 kg/m²</w:t>
             </w:r>
           </w:p>
         </w:tc>

</xml_diff>

<commit_message>
002 3.0: grupos de columnas y largueros, notas de masas y referencias
Correcciones de la revisión cruzada (sin cambio de resultados):
- STD: _COLUMNAS_EJES_1_Y_3 y _COLUMNAS_EJE_2 con los miembros de cada
  eje; _LARGUEROS_AB_10M/6M pasan a _LARGUEROS_AB_C12/C23 (claros de 8 m).
- DXF: la planta de nodos da la masa total del caso 4 de cada cabeza
  (techo + muros y cortina) y la nota ya no dice que sólo va el techo.
- Áreas: notas de la hoja STAAD con la celda de MUROS que usa cada
  fórmula, encabezado de NODOS_TECHO O5 y referencia de RESUMEN B2.
- Desglose: la figura de cada familia no se separa de su pie.

Co-Authored-By: Claude Opus 5.5 <noreply@anthropic.com>
Claude-Session: https://claude.ai/code/session_01DbpSpoM7qi5cJ9LMKpwgVv
</commit_message>
<xml_diff>
--- a/002/002_DESTRUCTURAL_H5H6_3.0.docx
+++ b/002/002_DESTRUCTURAL_H5H6_3.0.docx
@@ -791,6 +791,7 @@
     </w:tbl>
     <w:p>
       <w:pPr>
+        <w:keepNext/>
         <w:spacing w:after="0"/>
         <w:jc w:val="center"/>
       </w:pPr>
@@ -1483,6 +1484,7 @@
     </w:p>
     <w:p>
       <w:pPr>
+        <w:keepNext/>
         <w:spacing w:after="0"/>
         <w:jc w:val="center"/>
       </w:pPr>
@@ -2303,6 +2305,7 @@
     </w:p>
     <w:p>
       <w:pPr>
+        <w:keepNext/>
         <w:spacing w:after="0"/>
         <w:jc w:val="center"/>
       </w:pPr>
@@ -2995,6 +2998,7 @@
     </w:p>
     <w:p>
       <w:pPr>
+        <w:keepNext/>
         <w:spacing w:after="0"/>
         <w:jc w:val="center"/>
       </w:pPr>
@@ -3687,6 +3691,7 @@
     </w:p>
     <w:p>
       <w:pPr>
+        <w:keepNext/>
         <w:spacing w:after="0"/>
         <w:jc w:val="center"/>
       </w:pPr>
@@ -4763,6 +4768,7 @@
     </w:p>
     <w:p>
       <w:pPr>
+        <w:keepNext/>
         <w:spacing w:after="0"/>
         <w:jc w:val="center"/>
       </w:pPr>
@@ -5583,6 +5589,7 @@
     </w:p>
     <w:p>
       <w:pPr>
+        <w:keepNext/>
         <w:spacing w:after="0"/>
         <w:jc w:val="center"/>
       </w:pPr>
@@ -6403,6 +6410,7 @@
     </w:p>
     <w:p>
       <w:pPr>
+        <w:keepNext/>
         <w:spacing w:after="0"/>
         <w:jc w:val="center"/>
       </w:pPr>

</xml_diff>

<commit_message>
002 3.0: masa sísmica de muros con 5.85 kg/m² y muro 1 partido a la mitad
Caso 4: cada cabeza lleva el techo (19.32 kg/m² × área tributaria), los
muros A y B de 0.30 m al alero con la mitad de cada claro, y el muro 1
partido en X = 5.04 m (cada mitad con sus vanos) a los nodos 7 y 8, más
media cortina en cada jamba: 7 = 1006.45, 8 = 1033.96, 75 y 76 =
1233.64, 9 y 10 = 609.54 kg. Muros y cortina 2610.84 kg = 5.85 × 378.30
+ 397.8. Mismos perfiles; factores X 1.0983 / Z 1.0209; 43.45 kg/m2.

Co-Authored-By: Claude Opus 5.5 <noreply@anthropic.com>
Claude-Session: https://claude.ai/code/session_01DbpSpoM7qi5cJ9LMKpwgVv
</commit_message>
<xml_diff>
--- a/002/002_DESTRUCTURAL_H5H6_3.0.docx
+++ b/002/002_DESTRUCTURAL_H5H6_3.0.docx
@@ -525,7 +525,7 @@
                 <w:i w:val="0"/>
                 <w:sz w:val="17"/>
               </w:rPr>
-              <w:t>91.73 %</w:t>
+              <w:t>91.66 %</w:t>
             </w:r>
           </w:p>
         </w:tc>
@@ -569,7 +569,7 @@
                 <w:i w:val="0"/>
                 <w:sz w:val="17"/>
               </w:rPr>
-              <w:t>96.12 %</w:t>
+              <w:t>96.10 %</w:t>
             </w:r>
           </w:p>
         </w:tc>
@@ -655,7 +655,7 @@
                 <w:i w:val="0"/>
                 <w:sz w:val="17"/>
               </w:rPr>
-              <w:t>1.0973</w:t>
+              <w:t>1.0983</w:t>
             </w:r>
           </w:p>
         </w:tc>
@@ -697,7 +697,7 @@
                 <w:i w:val="0"/>
                 <w:sz w:val="17"/>
               </w:rPr>
-              <w:t>1.0183</w:t>
+              <w:t>1.0209</w:t>
             </w:r>
           </w:p>
         </w:tc>

</xml_diff>

<commit_message>
002 3.0: modos y peso dinámico del .ANL 3.0 en la hoja de sismo
Corrida del usuario sin errores: 6673.62 kg de take off, ningún FAIL,
ratio máximo 0.933 (largueros de muro claro 2-3), deriva 0.01406 (0.937
del límite 0.015), DYNAMIC WEIGHT 12330.62 kg, T1 = 0.61669 s. Con los 43
modos del .ANL la hoja de sismo da factores X 1.0979 / Z 1.0218, que pasan
al STD. Se actualizan áreas tributarias (sección 5 y notas), desglose y
reacciones.

Co-Authored-By: Claude Opus 5.5 <noreply@anthropic.com>
Claude-Session: https://claude.ai/code/session_01DbpSpoM7qi5cJ9LMKpwgVv
</commit_message>
<xml_diff>
--- a/002/002_DESTRUCTURAL_H5H6_3.0.docx
+++ b/002/002_DESTRUCTURAL_H5H6_3.0.docx
@@ -462,7 +462,7 @@
                 <w:i w:val="0"/>
                 <w:sz w:val="17"/>
               </w:rPr>
-              <w:t>Modos (motor de análisis)</w:t>
+              <w:t>Modos (corrida 3.0)</w:t>
             </w:r>
           </w:p>
         </w:tc>
@@ -525,7 +525,7 @@
                 <w:i w:val="0"/>
                 <w:sz w:val="17"/>
               </w:rPr>
-              <w:t>91.66 %</w:t>
+              <w:t>91.64 %</w:t>
             </w:r>
           </w:p>
         </w:tc>
@@ -569,7 +569,7 @@
                 <w:i w:val="0"/>
                 <w:sz w:val="17"/>
               </w:rPr>
-              <w:t>96.10 %</w:t>
+              <w:t>95.91 %</w:t>
             </w:r>
           </w:p>
         </w:tc>
@@ -655,7 +655,7 @@
                 <w:i w:val="0"/>
                 <w:sz w:val="17"/>
               </w:rPr>
-              <w:t>1.0983</w:t>
+              <w:t>1.0979</w:t>
             </w:r>
           </w:p>
         </w:tc>
@@ -697,7 +697,7 @@
                 <w:i w:val="0"/>
                 <w:sz w:val="17"/>
               </w:rPr>
-              <w:t>1.0209</w:t>
+              <w:t>1.0218</w:t>
             </w:r>
           </w:p>
         </w:tc>

</xml_diff>